<commit_message>
Update chapter 8 assignment latest version
</commit_message>
<xml_diff>
--- a/ch8/Individual_Assignment/employee-directory/Chapter8_A24CS4045_ZUO_BOYU_Report.docx
+++ b/ch8/Individual_Assignment/employee-directory/Chapter8_A24CS4045_ZUO_BOYU_Report.docx
@@ -12,14 +12,14 @@
           <w:rFonts w:ascii="Calibri" w:hAnsi="Calibri"/>
           <w:b/>
           <w:color w:val="0F172A"/>
-          <w:sz w:val="40"/>
+          <w:sz w:val="36"/>
         </w:rPr>
         <w:t>Chapter 8 Individual Assignment Report</w:t>
       </w:r>
     </w:p>
     <w:p>
       <w:pPr>
-        <w:spacing w:before="0" w:after="200" w:line="264" w:lineRule="auto"/>
+        <w:spacing w:before="0" w:after="160" w:line="264" w:lineRule="auto"/>
         <w:jc w:val="center"/>
       </w:pPr>
       <w:r>
@@ -48,7 +48,7 @@
       <w:tr>
         <w:tc>
           <w:tcPr>
-            <w:tcW w:type="dxa" w:w="2484"/>
+            <w:tcW w:type="dxa" w:w="2520"/>
             <w:vAlign w:val="center"/>
             <w:shd w:fill="F2F4F7"/>
           </w:tcPr>
@@ -68,7 +68,7 @@
         </w:tc>
         <w:tc>
           <w:tcPr>
-            <w:tcW w:type="dxa" w:w="2484"/>
+            <w:tcW w:type="dxa" w:w="2520"/>
             <w:vAlign w:val="center"/>
             <w:shd w:fill="F2F4F7"/>
           </w:tcPr>
@@ -88,7 +88,7 @@
         </w:tc>
         <w:tc>
           <w:tcPr>
-            <w:tcW w:type="dxa" w:w="2484"/>
+            <w:tcW w:type="dxa" w:w="2520"/>
             <w:vAlign w:val="center"/>
             <w:shd w:fill="F2F4F7"/>
           </w:tcPr>
@@ -108,7 +108,7 @@
         </w:tc>
         <w:tc>
           <w:tcPr>
-            <w:tcW w:type="dxa" w:w="2484"/>
+            <w:tcW w:type="dxa" w:w="2520"/>
             <w:vAlign w:val="center"/>
             <w:shd w:fill="F2F4F7"/>
           </w:tcPr>
@@ -130,7 +130,7 @@
       <w:tr>
         <w:tc>
           <w:tcPr>
-            <w:tcW w:type="dxa" w:w="2484"/>
+            <w:tcW w:type="dxa" w:w="2520"/>
             <w:vAlign w:val="center"/>
           </w:tcPr>
           <w:p>
@@ -149,7 +149,7 @@
         </w:tc>
         <w:tc>
           <w:tcPr>
-            <w:tcW w:type="dxa" w:w="2484"/>
+            <w:tcW w:type="dxa" w:w="2520"/>
             <w:vAlign w:val="center"/>
           </w:tcPr>
           <w:p>
@@ -168,7 +168,7 @@
         </w:tc>
         <w:tc>
           <w:tcPr>
-            <w:tcW w:type="dxa" w:w="2484"/>
+            <w:tcW w:type="dxa" w:w="2520"/>
             <w:vAlign w:val="center"/>
           </w:tcPr>
           <w:p>
@@ -181,13 +181,13 @@
                 <w:b w:val="0"/>
                 <w:sz w:val="18"/>
               </w:rPr>
-              <w:t>Project</w:t>
+              <w:t>Chapter</w:t>
             </w:r>
           </w:p>
         </w:tc>
         <w:tc>
           <w:tcPr>
-            <w:tcW w:type="dxa" w:w="2484"/>
+            <w:tcW w:type="dxa" w:w="2520"/>
             <w:vAlign w:val="center"/>
           </w:tcPr>
           <w:p>
@@ -200,7 +200,7 @@
                 <w:b w:val="0"/>
                 <w:sz w:val="18"/>
               </w:rPr>
-              <w:t>Employee Directory</w:t>
+              <w:t>8 - Connecting Vue to Backend</w:t>
             </w:r>
           </w:p>
         </w:tc>
@@ -215,9 +215,9 @@
           <w:rFonts w:ascii="Calibri" w:hAnsi="Calibri"/>
           <w:b/>
           <w:color w:val="2E74B5"/>
-          <w:sz w:val="32"/>
+          <w:sz w:val="30"/>
         </w:rPr>
-        <w:t>1. Working User Interface</w:t>
+        <w:t>1. Working UI Screenshots</w:t>
       </w:r>
     </w:p>
     <w:p>
@@ -230,7 +230,7 @@
           <w:b w:val="0"/>
           <w:sz w:val="21"/>
         </w:rPr>
-        <w:t>The Employee Directory is a single-page HR admin interface with summary cards, an add/edit form, search and sort controls, paginated employee records, and visible active/inactive status badges.</w:t>
+        <w:t>Figure 1 shows the laptop view with summary cards, the add/edit form, search and sort controls, the paginated table, active/inactive badges, and Malaysian Ringgit salary formatting. Figure 2 shows the same UI re-flowed at tablet width: the form stacks above the table and no horizontal scrolling is required.</w:t>
       </w:r>
     </w:p>
     <w:p>
@@ -240,7 +240,7 @@
       <w:r>
         <w:drawing>
           <wp:inline xmlns:a="http://schemas.openxmlformats.org/drawingml/2006/main" xmlns:pic="http://schemas.openxmlformats.org/drawingml/2006/picture">
-            <wp:extent cx="5897880" cy="3888712"/>
+            <wp:extent cx="5760720" cy="3798277"/>
             <wp:docPr id="1" name="Picture 1"/>
             <wp:cNvGraphicFramePr>
               <a:graphicFrameLocks noChangeAspect="1"/>
@@ -261,7 +261,61 @@
                   <pic:spPr>
                     <a:xfrm>
                       <a:off x="0" y="0"/>
-                      <a:ext cx="5897880" cy="3888712"/>
+                      <a:ext cx="5760720" cy="3798277"/>
+                    </a:xfrm>
+                    <a:prstGeom prst="rect"/>
+                  </pic:spPr>
+                </pic:pic>
+              </a:graphicData>
+            </a:graphic>
+          </wp:inline>
+        </w:drawing>
+      </w:r>
+    </w:p>
+    <w:p>
+      <w:pPr>
+        <w:spacing w:before="0" w:after="80" w:line="264" w:lineRule="auto"/>
+        <w:jc w:val="center"/>
+      </w:pPr>
+      <w:r>
+        <w:rPr>
+          <w:rFonts w:ascii="Calibri" w:hAnsi="Calibri"/>
+          <w:b w:val="0"/>
+          <w:color w:val="555F6E"/>
+          <w:sz w:val="17"/>
+        </w:rPr>
+        <w:t>Figure 1. Laptop view (&gt;=1024 px): summary cards, form, paginated table, status badges, RM salaries.</w:t>
+      </w:r>
+    </w:p>
+    <w:p>
+      <w:pPr>
+        <w:jc w:val="center"/>
+      </w:pPr>
+      <w:r>
+        <w:drawing>
+          <wp:inline xmlns:a="http://schemas.openxmlformats.org/drawingml/2006/main" xmlns:pic="http://schemas.openxmlformats.org/drawingml/2006/picture">
+            <wp:extent cx="3291840" cy="3657600"/>
+            <wp:docPr id="2" name="Picture 2"/>
+            <wp:cNvGraphicFramePr>
+              <a:graphicFrameLocks noChangeAspect="1"/>
+            </wp:cNvGraphicFramePr>
+            <a:graphic>
+              <a:graphicData uri="http://schemas.openxmlformats.org/drawingml/2006/picture">
+                <pic:pic>
+                  <pic:nvPicPr>
+                    <pic:cNvPr id="0" name="tablet-screenshot.png"/>
+                    <pic:cNvPicPr/>
+                  </pic:nvPicPr>
+                  <pic:blipFill>
+                    <a:blip r:embed="rId10"/>
+                    <a:stretch>
+                      <a:fillRect/>
+                    </a:stretch>
+                  </pic:blipFill>
+                  <pic:spPr>
+                    <a:xfrm>
+                      <a:off x="0" y="0"/>
+                      <a:ext cx="3291840" cy="3657600"/>
                     </a:xfrm>
                     <a:prstGeom prst="rect"/>
                   </pic:spPr>
@@ -284,7 +338,7 @@
           <w:color w:val="555F6E"/>
           <w:sz w:val="17"/>
         </w:rPr>
-        <w:t>Figure 1. Employee Directory frontend with 21 seeded employees and pagination.</w:t>
+        <w:t>Figure 2. Tablet view (&gt;=768 px): the workspace grid collapses to a single column.</w:t>
       </w:r>
     </w:p>
     <w:p>
@@ -301,9 +355,9 @@
           <w:rFonts w:ascii="Calibri" w:hAnsi="Calibri"/>
           <w:b/>
           <w:color w:val="2E74B5"/>
-          <w:sz w:val="32"/>
+          <w:sz w:val="30"/>
         </w:rPr>
-        <w:t>2. How the Project Meets the Brief</w:t>
+        <w:t>2. Chapter 8 Learning Outcomes - Code Evidence</w:t>
       </w:r>
     </w:p>
     <w:tbl>
@@ -314,14 +368,14 @@
         <w:tblLook w:firstColumn="1" w:firstRow="1" w:lastColumn="0" w:lastRow="0" w:noHBand="0" w:noVBand="1" w:val="04A0"/>
       </w:tblPr>
       <w:tblGrid>
-        <w:gridCol w:w="1800"/>
-        <w:gridCol w:w="3672"/>
-        <w:gridCol w:w="3384"/>
+        <w:gridCol w:w="1872"/>
+        <w:gridCol w:w="3888"/>
+        <w:gridCol w:w="3600"/>
       </w:tblGrid>
       <w:tr>
         <w:tc>
           <w:tcPr>
-            <w:tcW w:type="dxa" w:w="3312"/>
+            <w:tcW w:type="dxa" w:w="3360"/>
             <w:vAlign w:val="center"/>
             <w:shd w:fill="F2F4F7"/>
           </w:tcPr>
@@ -335,13 +389,13 @@
                 <w:b/>
                 <w:sz w:val="18"/>
               </w:rPr>
-              <w:t>Area</w:t>
+              <w:t>Learning Outcome</w:t>
             </w:r>
           </w:p>
         </w:tc>
         <w:tc>
           <w:tcPr>
-            <w:tcW w:type="dxa" w:w="3312"/>
+            <w:tcW w:type="dxa" w:w="3360"/>
             <w:vAlign w:val="center"/>
             <w:shd w:fill="F2F4F7"/>
           </w:tcPr>
@@ -355,13 +409,13 @@
                 <w:b/>
                 <w:sz w:val="18"/>
               </w:rPr>
-              <w:t>Brief Requirement</w:t>
+              <w:t>How the project satisfies it</w:t>
             </w:r>
           </w:p>
         </w:tc>
         <w:tc>
           <w:tcPr>
-            <w:tcW w:type="dxa" w:w="3312"/>
+            <w:tcW w:type="dxa" w:w="3360"/>
             <w:vAlign w:val="center"/>
             <w:shd w:fill="F2F4F7"/>
           </w:tcPr>
@@ -375,7 +429,7 @@
                 <w:b/>
                 <w:sz w:val="18"/>
               </w:rPr>
-              <w:t>Implementation</w:t>
+              <w:t>Where to look (file:line)</w:t>
             </w:r>
           </w:p>
         </w:tc>
@@ -383,7 +437,7 @@
       <w:tr>
         <w:tc>
           <w:tcPr>
-            <w:tcW w:type="dxa" w:w="1800"/>
+            <w:tcW w:type="dxa" w:w="1872"/>
             <w:vAlign w:val="center"/>
           </w:tcPr>
           <w:p>
@@ -396,13 +450,13 @@
                 <w:b w:val="0"/>
                 <w:sz w:val="18"/>
               </w:rPr>
-              <w:t>Frontend</w:t>
+              <w:t>LO1. Connect Vue to a REST backend.</w:t>
             </w:r>
           </w:p>
         </w:tc>
         <w:tc>
           <w:tcPr>
-            <w:tcW w:type="dxa" w:w="3672"/>
+            <w:tcW w:type="dxa" w:w="3888"/>
             <w:vAlign w:val="center"/>
           </w:tcPr>
           <w:p>
@@ -415,13 +469,13 @@
                 <w:b w:val="0"/>
                 <w:sz w:val="18"/>
               </w:rPr>
-              <w:t>Vue 3 Composition API with Vite.</w:t>
+              <w:t>App.vue owns employees and loading flags; onMounted triggers loadEmployees(); errors surface in a banner.</w:t>
             </w:r>
           </w:p>
         </w:tc>
         <w:tc>
           <w:tcPr>
-            <w:tcW w:type="dxa" w:w="3384"/>
+            <w:tcW w:type="dxa" w:w="3600"/>
             <w:vAlign w:val="center"/>
           </w:tcPr>
           <w:p>
@@ -434,7 +488,7 @@
                 <w:b w:val="0"/>
                 <w:sz w:val="18"/>
               </w:rPr>
-              <w:t>Uses .vue components, &lt;script setup&gt;, parent-held state, props, and emits.</w:t>
+              <w:t>src/App.vue:28, 30-53, 148</w:t>
             </w:r>
           </w:p>
         </w:tc>
@@ -442,7 +496,7 @@
       <w:tr>
         <w:tc>
           <w:tcPr>
-            <w:tcW w:type="dxa" w:w="1800"/>
+            <w:tcW w:type="dxa" w:w="1872"/>
             <w:vAlign w:val="center"/>
           </w:tcPr>
           <w:p>
@@ -455,13 +509,13 @@
                 <w:b w:val="0"/>
                 <w:sz w:val="18"/>
               </w:rPr>
-              <w:t>Axios</w:t>
+              <w:t>LO2. Use Axios with interceptors and async/await.</w:t>
             </w:r>
           </w:p>
         </w:tc>
         <w:tc>
           <w:tcPr>
-            <w:tcW w:type="dxa" w:w="3672"/>
+            <w:tcW w:type="dxa" w:w="3888"/>
             <w:vAlign w:val="center"/>
           </w:tcPr>
           <w:p>
@@ -474,13 +528,13 @@
                 <w:b w:val="0"/>
                 <w:sz w:val="18"/>
               </w:rPr>
-              <w:t>Single Axios instance with interceptors.</w:t>
+              <w:t>Single axios.create() instance with baseURL/timeout/headers. Request interceptor logs every call; response interceptor maps every error shape to {message, status, errors}. All call sites are async/await.</w:t>
             </w:r>
           </w:p>
         </w:tc>
         <w:tc>
           <w:tcPr>
-            <w:tcW w:type="dxa" w:w="3384"/>
+            <w:tcW w:type="dxa" w:w="3600"/>
             <w:vAlign w:val="center"/>
           </w:tcPr>
           <w:p>
@@ -493,7 +547,7 @@
                 <w:b w:val="0"/>
                 <w:sz w:val="18"/>
               </w:rPr>
-              <w:t>src/services/api.js defines baseURL, timeout, headers, request logging, and mapped error messages.</w:t>
+              <w:t>src/services/api.js:3, 12, 18, 35-52</w:t>
             </w:r>
           </w:p>
         </w:tc>
@@ -501,7 +555,7 @@
       <w:tr>
         <w:tc>
           <w:tcPr>
-            <w:tcW w:type="dxa" w:w="1800"/>
+            <w:tcW w:type="dxa" w:w="1872"/>
             <w:vAlign w:val="center"/>
           </w:tcPr>
           <w:p>
@@ -514,13 +568,13 @@
                 <w:b w:val="0"/>
                 <w:sz w:val="18"/>
               </w:rPr>
-              <w:t>Backend</w:t>
+              <w:t>LO3. Validated Vue forms with v-model and emits.</w:t>
             </w:r>
           </w:p>
         </w:tc>
         <w:tc>
           <w:tcPr>
-            <w:tcW w:type="dxa" w:w="3672"/>
+            <w:tcW w:type="dxa" w:w="3888"/>
             <w:vAlign w:val="center"/>
           </w:tcPr>
           <w:p>
@@ -533,13 +587,13 @@
                 <w:b w:val="0"/>
                 <w:sz w:val="18"/>
               </w:rPr>
-              <w:t>Express API with /employees CRUD.</w:t>
+              <w:t>EmployeeForm.vue uses v-model.trim on text inputs and v-model.number on Salary. validate() enforces all seven rules; inline field errors render before submit; payload is emitted to the parent.</w:t>
             </w:r>
           </w:p>
         </w:tc>
         <w:tc>
           <w:tcPr>
-            <w:tcW w:type="dxa" w:w="3384"/>
+            <w:tcW w:type="dxa" w:w="3600"/>
             <w:vAlign w:val="center"/>
           </w:tcPr>
           <w:p>
@@ -552,7 +606,7 @@
                 <w:b w:val="0"/>
                 <w:sz w:val="18"/>
               </w:rPr>
-              <w:t>server/index.cjs implements GET, POST, PUT, DELETE, search, sort, and pagination.</w:t>
+              <w:t>src/components/EmployeeForm.vue:73-94, 135, 177, 50</w:t>
             </w:r>
           </w:p>
         </w:tc>
@@ -560,7 +614,7 @@
       <w:tr>
         <w:tc>
           <w:tcPr>
-            <w:tcW w:type="dxa" w:w="1800"/>
+            <w:tcW w:type="dxa" w:w="1872"/>
             <w:vAlign w:val="center"/>
           </w:tcPr>
           <w:p>
@@ -573,13 +627,13 @@
                 <w:b w:val="0"/>
                 <w:sz w:val="18"/>
               </w:rPr>
-              <w:t>Database</w:t>
+              <w:t>LO4. CRUD against MySQL with prepared statements, search and sort.</w:t>
             </w:r>
           </w:p>
         </w:tc>
         <w:tc>
           <w:tcPr>
-            <w:tcW w:type="dxa" w:w="3672"/>
+            <w:tcW w:type="dxa" w:w="3888"/>
             <w:vAlign w:val="center"/>
           </w:tcPr>
           <w:p>
@@ -592,13 +646,13 @@
                 <w:b w:val="0"/>
                 <w:sz w:val="18"/>
               </w:rPr>
-              <w:t>MySQL with mysql2 promise pool and prepared statements.</w:t>
+              <w:t>Express implements GET/POST/PUT/DELETE /employees. LIKE search on 4 columns; ORDER BY restricted to a whitelist; all values use ? placeholders, including LIMIT/OFFSET; mysql2/promise pool.</w:t>
             </w:r>
           </w:p>
         </w:tc>
         <w:tc>
           <w:tcPr>
-            <w:tcW w:type="dxa" w:w="3384"/>
+            <w:tcW w:type="dxa" w:w="3600"/>
             <w:vAlign w:val="center"/>
           </w:tcPr>
           <w:p>
@@ -611,125 +665,7 @@
                 <w:b w:val="0"/>
                 <w:sz w:val="18"/>
               </w:rPr>
-              <w:t>server/db.cjs uses mysql2/promise; SQL values use ? placeholders.</w:t>
-            </w:r>
-          </w:p>
-        </w:tc>
-      </w:tr>
-      <w:tr>
-        <w:tc>
-          <w:tcPr>
-            <w:tcW w:type="dxa" w:w="1800"/>
-            <w:vAlign w:val="center"/>
-          </w:tcPr>
-          <w:p>
-            <w:pPr>
-              <w:spacing w:before="0" w:after="0" w:line="264" w:lineRule="auto"/>
-            </w:pPr>
-            <w:r>
-              <w:rPr>
-                <w:rFonts w:ascii="Calibri" w:hAnsi="Calibri"/>
-                <w:b w:val="0"/>
-                <w:sz w:val="18"/>
-              </w:rPr>
-              <w:t>Seed data</w:t>
-            </w:r>
-          </w:p>
-        </w:tc>
-        <w:tc>
-          <w:tcPr>
-            <w:tcW w:type="dxa" w:w="3672"/>
-            <w:vAlign w:val="center"/>
-          </w:tcPr>
-          <w:p>
-            <w:pPr>
-              <w:spacing w:before="0" w:after="0" w:line="264" w:lineRule="auto"/>
-            </w:pPr>
-            <w:r>
-              <w:rPr>
-                <w:rFonts w:ascii="Calibri" w:hAnsi="Calibri"/>
-                <w:b w:val="0"/>
-                <w:sz w:val="18"/>
-              </w:rPr>
-              <w:t>At least 7 employees across 3 departments with inactive staff.</w:t>
-            </w:r>
-          </w:p>
-        </w:tc>
-        <w:tc>
-          <w:tcPr>
-            <w:tcW w:type="dxa" w:w="3384"/>
-            <w:vAlign w:val="center"/>
-          </w:tcPr>
-          <w:p>
-            <w:pPr>
-              <w:spacing w:before="0" w:after="0" w:line="264" w:lineRule="auto"/>
-            </w:pPr>
-            <w:r>
-              <w:rPr>
-                <w:rFonts w:ascii="Calibri" w:hAnsi="Calibri"/>
-                <w:b w:val="0"/>
-                <w:sz w:val="18"/>
-              </w:rPr>
-              <w:t>schema.sql now inserts 21 employees across five departments, including inactive records.</w:t>
-            </w:r>
-          </w:p>
-        </w:tc>
-      </w:tr>
-      <w:tr>
-        <w:tc>
-          <w:tcPr>
-            <w:tcW w:type="dxa" w:w="1800"/>
-            <w:vAlign w:val="center"/>
-          </w:tcPr>
-          <w:p>
-            <w:pPr>
-              <w:spacing w:before="0" w:after="0" w:line="264" w:lineRule="auto"/>
-            </w:pPr>
-            <w:r>
-              <w:rPr>
-                <w:rFonts w:ascii="Calibri" w:hAnsi="Calibri"/>
-                <w:b w:val="0"/>
-                <w:sz w:val="18"/>
-              </w:rPr>
-              <w:t>UX</w:t>
-            </w:r>
-          </w:p>
-        </w:tc>
-        <w:tc>
-          <w:tcPr>
-            <w:tcW w:type="dxa" w:w="3672"/>
-            <w:vAlign w:val="center"/>
-          </w:tcPr>
-          <w:p>
-            <w:pPr>
-              <w:spacing w:before="0" w:after="0" w:line="264" w:lineRule="auto"/>
-            </w:pPr>
-            <w:r>
-              <w:rPr>
-                <w:rFonts w:ascii="Calibri" w:hAnsi="Calibri"/>
-                <w:b w:val="0"/>
-                <w:sz w:val="18"/>
-              </w:rPr>
-              <w:t>Loading, error, active/inactive display, RM formatting, responsive layout.</w:t>
-            </w:r>
-          </w:p>
-        </w:tc>
-        <w:tc>
-          <w:tcPr>
-            <w:tcW w:type="dxa" w:w="3384"/>
-            <w:vAlign w:val="center"/>
-          </w:tcPr>
-          <w:p>
-            <w:pPr>
-              <w:spacing w:before="0" w:after="0" w:line="264" w:lineRule="auto"/>
-            </w:pPr>
-            <w:r>
-              <w:rPr>
-                <w:rFonts w:ascii="Calibri" w:hAnsi="Calibri"/>
-                <w:b w:val="0"/>
-                <w:sz w:val="18"/>
-              </w:rPr>
-              <w:t>EmployeeList shows loading/empty states, badges, MYR currency, and page controls.</w:t>
+              <w:t>server/index.js:12, 26-73, 89, 120, 154; server/db.js:4</w:t>
             </w:r>
           </w:p>
         </w:tc>
@@ -744,9 +680,9 @@
           <w:rFonts w:ascii="Calibri" w:hAnsi="Calibri"/>
           <w:b/>
           <w:color w:val="2E74B5"/>
-          <w:sz w:val="32"/>
+          <w:sz w:val="30"/>
         </w:rPr>
-        <w:t>3. Learning Outcomes</w:t>
+        <w:t>3. Architecture and Component Structure</w:t>
       </w:r>
     </w:p>
     <w:p>
@@ -757,10 +693,18 @@
       <w:r>
         <w:rPr>
           <w:rFonts w:ascii="Calibri" w:hAnsi="Calibri"/>
+          <w:b/>
+          <w:sz w:val="20"/>
+        </w:rPr>
+        <w:t xml:space="preserve">Parent state: </w:t>
+      </w:r>
+      <w:r>
+        <w:rPr>
+          <w:rFonts w:ascii="Calibri" w:hAnsi="Calibri"/>
           <w:b w:val="0"/>
           <w:sz w:val="20"/>
         </w:rPr>
-        <w:t>LO1: Vue connects to an external REST API and refreshes employee data from the Express backend.</w:t>
+        <w:t>App.vue owns employees, filters, pagination metadata, and the currently selected employee. Children never call the API directly.</w:t>
       </w:r>
     </w:p>
     <w:p>
@@ -771,10 +715,18 @@
       <w:r>
         <w:rPr>
           <w:rFonts w:ascii="Calibri" w:hAnsi="Calibri"/>
+          <w:b/>
+          <w:sz w:val="20"/>
+        </w:rPr>
+        <w:t xml:space="preserve">Children and emits: </w:t>
+      </w:r>
+      <w:r>
+        <w:rPr>
+          <w:rFonts w:ascii="Calibri" w:hAnsi="Calibri"/>
           <w:b w:val="0"/>
           <w:sz w:val="20"/>
         </w:rPr>
-        <w:t>LO2: Axios is configured as a reusable service module with central request and response handling.</w:t>
+        <w:t>EmployeeForm emits save/cancel; EmployeeList emits edit/delete/page-change; SearchSortControls emits change with debounced search and whitelisted sort keys.</w:t>
       </w:r>
     </w:p>
     <w:p>
@@ -785,10 +737,18 @@
       <w:r>
         <w:rPr>
           <w:rFonts w:ascii="Calibri" w:hAnsi="Calibri"/>
+          <w:b/>
+          <w:sz w:val="20"/>
+        </w:rPr>
+        <w:t xml:space="preserve">Service layer: </w:t>
+      </w:r>
+      <w:r>
+        <w:rPr>
+          <w:rFonts w:ascii="Calibri" w:hAnsi="Calibri"/>
           <w:b w:val="0"/>
           <w:sz w:val="20"/>
         </w:rPr>
-        <w:t>LO3: The form uses v-model modifiers, custom validation rules, and inline messages before submission.</w:t>
+        <w:t>src/services/api.js is the only file that imports Axios. Components import named functions and stay transport-agnostic.</w:t>
       </w:r>
     </w:p>
     <w:p>
@@ -799,10 +759,18 @@
       <w:r>
         <w:rPr>
           <w:rFonts w:ascii="Calibri" w:hAnsi="Calibri"/>
+          <w:b/>
+          <w:sz w:val="20"/>
+        </w:rPr>
+        <w:t xml:space="preserve">Validation boundary: </w:t>
+      </w:r>
+      <w:r>
+        <w:rPr>
+          <w:rFonts w:ascii="Calibri" w:hAnsi="Calibri"/>
           <w:b w:val="0"/>
           <w:sz w:val="20"/>
         </w:rPr>
-        <w:t>LO4: MySQL persistence is handled through prepared statements with CRUD, server-side search, sort, and pagination.</w:t>
+        <w:t>Validation runs twice: in EmployeeForm.validate() for inline feedback, and in server validateEmployee() as the authoritative gate before any SQL write. Duplicate empId/email becomes a friendly per-field error via the ER_DUP_ENTRY handler.</w:t>
       </w:r>
     </w:p>
     <w:p>
@@ -819,9 +787,111 @@
           <w:rFonts w:ascii="Calibri" w:hAnsi="Calibri"/>
           <w:b/>
           <w:color w:val="2E74B5"/>
-          <w:sz w:val="32"/>
+          <w:sz w:val="30"/>
         </w:rPr>
-        <w:t>4. Main Features</w:t>
+        <w:t>4. Challenges and Resolutions</w:t>
+      </w:r>
+    </w:p>
+    <w:p>
+      <w:pPr>
+        <w:pStyle w:val="ListBullet"/>
+        <w:spacing w:before="0" w:after="60" w:line="264" w:lineRule="auto"/>
+      </w:pPr>
+      <w:r>
+        <w:rPr>
+          <w:rFonts w:ascii="Calibri" w:hAnsi="Calibri"/>
+          <w:b/>
+          <w:sz w:val="20"/>
+        </w:rPr>
+        <w:t xml:space="preserve">Safe sorting: </w:t>
+      </w:r>
+      <w:r>
+        <w:rPr>
+          <w:rFonts w:ascii="Calibri" w:hAnsi="Calibri"/>
+          <w:b w:val="0"/>
+          <w:sz w:val="20"/>
+        </w:rPr>
+        <w:t>Mapped req.query.sortBy through a fixed whitelist object; unknown keys fall back to name. The direction is reduced to the literal 'ASC' or 'DESC' before interpolation.</w:t>
+      </w:r>
+    </w:p>
+    <w:p>
+      <w:pPr>
+        <w:pStyle w:val="ListBullet"/>
+        <w:spacing w:before="0" w:after="60" w:line="264" w:lineRule="auto"/>
+      </w:pPr>
+      <w:r>
+        <w:rPr>
+          <w:rFonts w:ascii="Calibri" w:hAnsi="Calibri"/>
+          <w:b/>
+          <w:sz w:val="20"/>
+        </w:rPr>
+        <w:t xml:space="preserve">Heterogeneous Axios errors: </w:t>
+      </w:r>
+      <w:r>
+        <w:rPr>
+          <w:rFonts w:ascii="Calibri" w:hAnsi="Calibri"/>
+          <w:b w:val="0"/>
+          <w:sz w:val="20"/>
+        </w:rPr>
+        <w:t>Server validation errors, 5xx responses, DNS failures, and timeouts each produce a different Axios error shape. The response interceptor normalises them into one {message, status, errors} object the UI consumes.</w:t>
+      </w:r>
+    </w:p>
+    <w:p>
+      <w:pPr>
+        <w:pStyle w:val="ListBullet"/>
+        <w:spacing w:before="0" w:after="60" w:line="264" w:lineRule="auto"/>
+      </w:pPr>
+      <w:r>
+        <w:rPr>
+          <w:rFonts w:ascii="Calibri" w:hAnsi="Calibri"/>
+          <w:b/>
+          <w:sz w:val="20"/>
+        </w:rPr>
+        <w:t xml:space="preserve">IPv6 vs IPv4 on Windows/Laragon: </w:t>
+      </w:r>
+      <w:r>
+        <w:rPr>
+          <w:rFonts w:ascii="Calibri" w:hAnsi="Calibri"/>
+          <w:b w:val="0"/>
+          <w:sz w:val="20"/>
+        </w:rPr>
+        <w:t>Node 18+ resolves localhost to ::1 while Laragon MySQL binds 127.0.0.1. The pool and CORS allow-list pin to 127.0.0.1 to avoid intermittent ECONNREFUSED.</w:t>
+      </w:r>
+    </w:p>
+    <w:p>
+      <w:pPr>
+        <w:pStyle w:val="ListBullet"/>
+        <w:spacing w:before="0" w:after="60" w:line="264" w:lineRule="auto"/>
+      </w:pPr>
+      <w:r>
+        <w:rPr>
+          <w:rFonts w:ascii="Calibri" w:hAnsi="Calibri"/>
+          <w:b/>
+          <w:sz w:val="20"/>
+        </w:rPr>
+        <w:t xml:space="preserve">Responsive table on tablet: </w:t>
+      </w:r>
+      <w:r>
+        <w:rPr>
+          <w:rFonts w:ascii="Calibri" w:hAnsi="Calibri"/>
+          <w:b w:val="0"/>
+          <w:sz w:val="20"/>
+        </w:rPr>
+        <w:t>The workspace grid collapses to a single column at &lt;=768 px and the table sits in a horizontally-safe container, keeping the Actions column reachable without overflow.</w:t>
+      </w:r>
+    </w:p>
+    <w:p>
+      <w:pPr>
+        <w:spacing w:before="200" w:after="80" w:line="264" w:lineRule="auto"/>
+      </w:pPr>
+      <w:r>
+        <w:rPr>
+          <w:rFonts w:ascii="Calibri" w:hAnsi="Calibri"/>
+          <w:b/>
+          <w:color w:val="2E74B5"/>
+          <w:sz w:val="30"/>
+        </w:rPr>
+        <w:t>5. Extensions Beyond the Brief</w:t>
       </w:r>
     </w:p>
     <w:p>
@@ -835,7 +905,7 @@
           <w:b w:val="0"/>
           <w:sz w:val="20"/>
         </w:rPr>
-        <w:t>Create, read, update, and delete employee records through /employees.</w:t>
+        <w:t>Server-side pagination with clamped integers and a single count query that returns total/active/inactive in one round trip.</w:t>
       </w:r>
     </w:p>
     <w:p>
@@ -849,7 +919,7 @@
           <w:b w:val="0"/>
           <w:sz w:val="20"/>
         </w:rPr>
-        <w:t>Search by name, employee ID, email, or department using SQL LIKE.</w:t>
+        <w:t>Search extended to a fourth column (department) on top of the required three.</w:t>
       </w:r>
     </w:p>
     <w:p>
@@ -863,7 +933,7 @@
           <w:b w:val="0"/>
           <w:sz w:val="20"/>
         </w:rPr>
-        <w:t>Sort by whitelisted fields: name, hire date, salary, and department.</w:t>
+        <w:t>Defensive server-side re-validation that mirrors the client rules, keeping the API safe even when called outside the Vue app.</w:t>
       </w:r>
     </w:p>
     <w:p>
@@ -877,7 +947,34 @@
           <w:b w:val="0"/>
           <w:sz w:val="20"/>
         </w:rPr>
-        <w:t>Switch pages with 7 employees per page across 21 seed records.</w:t>
+        <w:t>Summary cards driven by SUM(CASE WHEN active...) so totals stay consistent with the active filter.</w:t>
+      </w:r>
+    </w:p>
+    <w:p>
+      <w:pPr>
+        <w:spacing w:before="200" w:after="80" w:line="264" w:lineRule="auto"/>
+      </w:pPr>
+      <w:r>
+        <w:rPr>
+          <w:rFonts w:ascii="Calibri" w:hAnsi="Calibri"/>
+          <w:b/>
+          <w:color w:val="2E74B5"/>
+          <w:sz w:val="30"/>
+        </w:rPr>
+        <w:t>6. Sources and References</w:t>
+      </w:r>
+    </w:p>
+    <w:p>
+      <w:pPr>
+        <w:spacing w:before="0" w:after="120" w:line="264" w:lineRule="auto"/>
+      </w:pPr>
+      <w:r>
+        <w:rPr>
+          <w:rFonts w:ascii="Calibri" w:hAnsi="Calibri"/>
+          <w:b w:val="0"/>
+          <w:sz w:val="21"/>
+        </w:rPr>
+        <w:t>Official documentation consulted during implementation. All code was written by me; AI assistants were used only for explanations and debugging.</w:t>
       </w:r>
     </w:p>
     <w:p>
@@ -891,41 +988,7 @@
           <w:b w:val="0"/>
           <w:sz w:val="20"/>
         </w:rPr>
-        <w:t>Show total, active, and inactive headcount in summary cards.</w:t>
-      </w:r>
-    </w:p>
-    <w:p>
-      <w:pPr>
-        <w:spacing w:before="200" w:after="80" w:line="264" w:lineRule="auto"/>
-      </w:pPr>
-      <w:r>
-        <w:rPr>
-          <w:rFonts w:ascii="Calibri" w:hAnsi="Calibri"/>
-          <w:b/>
-          <w:color w:val="2E74B5"/>
-          <w:sz w:val="32"/>
-        </w:rPr>
-        <w:t>5. Challenges and Resolutions</w:t>
-      </w:r>
-    </w:p>
-    <w:p>
-      <w:pPr>
-        <w:spacing w:before="0" w:after="120" w:line="264" w:lineRule="auto"/>
-      </w:pPr>
-      <w:r>
-        <w:rPr>
-          <w:rFonts w:ascii="Calibri" w:hAnsi="Calibri"/>
-          <w:b/>
-          <w:sz w:val="21"/>
-        </w:rPr>
-        <w:t xml:space="preserve">Database connection: </w:t>
-      </w:r>
-      <w:r>
-        <w:rPr>
-          <w:rFonts w:ascii="Calibri" w:hAnsi="Calibri"/>
-          <w:b w:val="0"/>
-          <w:sz w:val="21"/>
-        </w:rPr>
+        <w:t>Vue 3 - Composition API and &lt;script setup&gt;: https://vuejs.org/guide/</w:t>
       </w:r>
     </w:p>
     <w:p>
@@ -939,27 +1002,7 @@
           <w:b w:val="0"/>
           <w:sz w:val="20"/>
         </w:rPr>
-        <w:t>The API was updated to use 127.0.0.1 by default to avoid localhost IPv6 connection issues on Windows/Laragon.</w:t>
-      </w:r>
-    </w:p>
-    <w:p>
-      <w:pPr>
-        <w:spacing w:before="0" w:after="120" w:line="264" w:lineRule="auto"/>
-      </w:pPr>
-      <w:r>
-        <w:rPr>
-          <w:rFonts w:ascii="Calibri" w:hAnsi="Calibri"/>
-          <w:b/>
-          <w:sz w:val="21"/>
-        </w:rPr>
-        <w:t xml:space="preserve">Safe sorting: </w:t>
-      </w:r>
-      <w:r>
-        <w:rPr>
-          <w:rFonts w:ascii="Calibri" w:hAnsi="Calibri"/>
-          <w:b w:val="0"/>
-          <w:sz w:val="21"/>
-        </w:rPr>
+        <w:t>Vite configuration: https://vitejs.dev/config/</w:t>
       </w:r>
     </w:p>
     <w:p>
@@ -973,27 +1016,7 @@
           <w:b w:val="0"/>
           <w:sz w:val="20"/>
         </w:rPr>
-        <w:t>The server maps requested sort fields to a whitelist before building the ORDER BY clause.</w:t>
-      </w:r>
-    </w:p>
-    <w:p>
-      <w:pPr>
-        <w:spacing w:before="0" w:after="120" w:line="264" w:lineRule="auto"/>
-      </w:pPr>
-      <w:r>
-        <w:rPr>
-          <w:rFonts w:ascii="Calibri" w:hAnsi="Calibri"/>
-          <w:b/>
-          <w:sz w:val="21"/>
-        </w:rPr>
-        <w:t xml:space="preserve">Responsive layout: </w:t>
-      </w:r>
-      <w:r>
-        <w:rPr>
-          <w:rFonts w:ascii="Calibri" w:hAnsi="Calibri"/>
-          <w:b w:val="0"/>
-          <w:sz w:val="21"/>
-        </w:rPr>
+        <w:t>Axios - instance configuration and interceptors: https://axios-http.com/docs/interceptors</w:t>
       </w:r>
     </w:p>
     <w:p>
@@ -1007,21 +1030,7 @@
           <w:b w:val="0"/>
           <w:sz w:val="20"/>
         </w:rPr>
-        <w:t>The UI was adjusted to remove sidebar crowding, keep the Actions column visible, and stack the form above the table on tablet widths.</w:t>
-      </w:r>
-    </w:p>
-    <w:p>
-      <w:pPr>
-        <w:spacing w:before="200" w:after="80" w:line="264" w:lineRule="auto"/>
-      </w:pPr>
-      <w:r>
-        <w:rPr>
-          <w:rFonts w:ascii="Calibri" w:hAnsi="Calibri"/>
-          <w:b/>
-          <w:color w:val="2E74B5"/>
-          <w:sz w:val="32"/>
-        </w:rPr>
-        <w:t>6. Setup Summary</w:t>
+        <w:t>Express 5 routing and middleware: https://expressjs.com/en/5x/api.html</w:t>
       </w:r>
     </w:p>
     <w:p>
@@ -1035,7 +1044,7 @@
           <w:b w:val="0"/>
           <w:sz w:val="20"/>
         </w:rPr>
-        <w:t>Import sql/schema.sql into Laragon MySQL.</w:t>
+        <w:t>mysql2 promise pool and prepared statements: https://github.com/sidorares/node-mysql2#using-prepared-statements</w:t>
       </w:r>
     </w:p>
     <w:p>
@@ -1049,40 +1058,12 @@
           <w:b w:val="0"/>
           <w:sz w:val="20"/>
         </w:rPr>
-        <w:t>Run npm install in the employee-directory folder.</w:t>
-      </w:r>
-    </w:p>
-    <w:p>
-      <w:pPr>
-        <w:pStyle w:val="ListBullet"/>
-        <w:spacing w:before="0" w:after="60" w:line="264" w:lineRule="auto"/>
-      </w:pPr>
-      <w:r>
-        <w:rPr>
-          <w:rFonts w:ascii="Calibri" w:hAnsi="Calibri"/>
-          <w:b w:val="0"/>
-          <w:sz w:val="20"/>
-        </w:rPr>
-        <w:t>Start the app with npm run dev or .\start-app.ps1.</w:t>
-      </w:r>
-    </w:p>
-    <w:p>
-      <w:pPr>
-        <w:pStyle w:val="ListBullet"/>
-        <w:spacing w:before="0" w:after="60" w:line="264" w:lineRule="auto"/>
-      </w:pPr>
-      <w:r>
-        <w:rPr>
-          <w:rFonts w:ascii="Calibri" w:hAnsi="Calibri"/>
-          <w:b w:val="0"/>
-          <w:sz w:val="20"/>
-        </w:rPr>
-        <w:t>Open http://127.0.0.1:5174 for the Vue frontend; the API runs on http://127.0.0.1:3001.</w:t>
+        <w:t>MDN Intl.NumberFormat for MYR formatting: https://developer.mozilla.org/en-US/docs/Web/JavaScript/Reference/Global_Objects/Intl/NumberFormat</w:t>
       </w:r>
     </w:p>
     <w:sectPr>
       <w:pgSz w:w="12240" w:h="15840"/>
-      <w:pgMar w:top="1152" w:right="1152" w:bottom="1080" w:left="1152" w:header="720" w:footer="720" w:gutter="0"/>
+      <w:pgMar w:top="1008" w:right="1080" w:bottom="936" w:left="1080" w:header="720" w:footer="720" w:gutter="0"/>
       <w:cols w:space="720"/>
       <w:docGrid w:linePitch="360"/>
     </w:sectPr>

</xml_diff>